<commit_message>
Update code contribution list
</commit_message>
<xml_diff>
--- a/CodeList.docx
+++ b/CodeList.docx
@@ -28,8 +28,8 @@
         <w:tblLook w:val="04A0" w:firstRow="1" w:lastRow="0" w:firstColumn="1" w:lastColumn="0" w:noHBand="0" w:noVBand="1"/>
       </w:tblPr>
       <w:tblGrid>
-        <w:gridCol w:w="3565"/>
-        <w:gridCol w:w="4731"/>
+        <w:gridCol w:w="4686"/>
+        <w:gridCol w:w="3610"/>
       </w:tblGrid>
       <w:tr>
         <w:tc>
@@ -244,7 +244,317 @@
                 <w:rFonts w:ascii="Century Schoolbook" w:hAnsi="Century Schoolbook"/>
                 <w:szCs w:val="22"/>
               </w:rPr>
-              <w:t>Provides the user login interface.</w:t>
+              <w:t>Provides the user registration interface for username, email and password details.</w:t>
+            </w:r>
+          </w:p>
+        </w:tc>
+      </w:tr>
+      <w:tr>
+        <w:tc>
+          <w:tcPr>
+            <w:tcW w:w="0" w:type="auto"/>
+          </w:tcPr>
+          <w:p>
+            <w:pPr>
+              <w:rPr>
+                <w:rFonts w:ascii="Century Schoolbook" w:hAnsi="Century Schoolbook"/>
+                <w:szCs w:val="22"/>
+              </w:rPr>
+            </w:pPr>
+            <w:r>
+              <w:rPr>
+                <w:rFonts w:ascii="Century Schoolbook" w:hAnsi="Century Schoolbook"/>
+                <w:szCs w:val="22"/>
+              </w:rPr>
+              <w:t>academics/models.py</w:t>
+            </w:r>
+          </w:p>
+        </w:tc>
+        <w:tc>
+          <w:tcPr>
+            <w:tcW w:w="0" w:type="auto"/>
+          </w:tcPr>
+          <w:p>
+            <w:pPr>
+              <w:rPr>
+                <w:rFonts w:ascii="Century Schoolbook" w:hAnsi="Century Schoolbook"/>
+                <w:szCs w:val="22"/>
+              </w:rPr>
+            </w:pPr>
+            <w:r>
+              <w:rPr>
+                <w:rFonts w:ascii="Century Schoolbook" w:hAnsi="Century Schoolbook"/>
+                <w:szCs w:val="22"/>
+              </w:rPr>
+              <w:t>Defines the main academic data models and academic calculation logic.</w:t>
+            </w:r>
+          </w:p>
+        </w:tc>
+      </w:tr>
+      <w:tr>
+        <w:tc>
+          <w:tcPr>
+            <w:tcW w:w="0" w:type="auto"/>
+          </w:tcPr>
+          <w:p>
+            <w:pPr>
+              <w:rPr>
+                <w:rFonts w:ascii="Century Schoolbook" w:hAnsi="Century Schoolbook"/>
+                <w:szCs w:val="22"/>
+              </w:rPr>
+            </w:pPr>
+            <w:r>
+              <w:rPr>
+                <w:rFonts w:ascii="Century Schoolbook" w:hAnsi="Century Schoolbook"/>
+                <w:szCs w:val="22"/>
+              </w:rPr>
+              <w:t>templates/academics/semester_list.html</w:t>
+            </w:r>
+          </w:p>
+        </w:tc>
+        <w:tc>
+          <w:tcPr>
+            <w:tcW w:w="0" w:type="auto"/>
+          </w:tcPr>
+          <w:p>
+            <w:pPr>
+              <w:rPr>
+                <w:rFonts w:ascii="Century Schoolbook" w:hAnsi="Century Schoolbook"/>
+                <w:szCs w:val="22"/>
+              </w:rPr>
+            </w:pPr>
+            <w:r>
+              <w:rPr>
+                <w:rFonts w:ascii="Century Schoolbook" w:hAnsi="Century Schoolbook"/>
+                <w:szCs w:val="22"/>
+              </w:rPr>
+              <w:t>Provides the semester management interface.</w:t>
+            </w:r>
+          </w:p>
+        </w:tc>
+      </w:tr>
+      <w:tr>
+        <w:tc>
+          <w:tcPr>
+            <w:tcW w:w="0" w:type="auto"/>
+          </w:tcPr>
+          <w:p>
+            <w:pPr>
+              <w:rPr>
+                <w:rFonts w:ascii="Century Schoolbook" w:hAnsi="Century Schoolbook"/>
+                <w:szCs w:val="22"/>
+              </w:rPr>
+            </w:pPr>
+            <w:r>
+              <w:rPr>
+                <w:rFonts w:ascii="Century Schoolbook" w:hAnsi="Century Schoolbook"/>
+                <w:szCs w:val="22"/>
+              </w:rPr>
+              <w:t>templates/academics/semester_form.html</w:t>
+            </w:r>
+          </w:p>
+        </w:tc>
+        <w:tc>
+          <w:tcPr>
+            <w:tcW w:w="0" w:type="auto"/>
+          </w:tcPr>
+          <w:p>
+            <w:pPr>
+              <w:rPr>
+                <w:rFonts w:ascii="Century Schoolbook" w:hAnsi="Century Schoolbook"/>
+                <w:szCs w:val="22"/>
+              </w:rPr>
+            </w:pPr>
+            <w:r>
+              <w:rPr>
+                <w:rFonts w:ascii="Century Schoolbook" w:hAnsi="Century Schoolbook"/>
+                <w:szCs w:val="22"/>
+              </w:rPr>
+              <w:t xml:space="preserve">Provides the semester </w:t>
+            </w:r>
+            <w:proofErr w:type="gramStart"/>
+            <w:r>
+              <w:rPr>
+                <w:rFonts w:ascii="Century Schoolbook" w:hAnsi="Century Schoolbook"/>
+                <w:szCs w:val="22"/>
+              </w:rPr>
+              <w:t>create</w:t>
+            </w:r>
+            <w:proofErr w:type="gramEnd"/>
+            <w:r>
+              <w:rPr>
+                <w:rFonts w:ascii="Century Schoolbook" w:hAnsi="Century Schoolbook"/>
+                <w:szCs w:val="22"/>
+              </w:rPr>
+              <w:t xml:space="preserve"> and edit form.</w:t>
+            </w:r>
+          </w:p>
+        </w:tc>
+      </w:tr>
+      <w:tr>
+        <w:tc>
+          <w:tcPr>
+            <w:tcW w:w="0" w:type="auto"/>
+          </w:tcPr>
+          <w:p>
+            <w:pPr>
+              <w:rPr>
+                <w:rFonts w:ascii="Century Schoolbook" w:hAnsi="Century Schoolbook"/>
+                <w:szCs w:val="22"/>
+              </w:rPr>
+            </w:pPr>
+            <w:r>
+              <w:rPr>
+                <w:rFonts w:ascii="Century Schoolbook" w:hAnsi="Century Schoolbook"/>
+                <w:szCs w:val="22"/>
+              </w:rPr>
+              <w:t>templates/academics/module_list.html</w:t>
+            </w:r>
+          </w:p>
+        </w:tc>
+        <w:tc>
+          <w:tcPr>
+            <w:tcW w:w="0" w:type="auto"/>
+          </w:tcPr>
+          <w:p>
+            <w:pPr>
+              <w:rPr>
+                <w:rFonts w:ascii="Century Schoolbook" w:hAnsi="Century Schoolbook"/>
+                <w:szCs w:val="22"/>
+              </w:rPr>
+            </w:pPr>
+            <w:r>
+              <w:rPr>
+                <w:rFonts w:ascii="Century Schoolbook" w:hAnsi="Century Schoolbook"/>
+                <w:szCs w:val="22"/>
+              </w:rPr>
+              <w:t>Provides the module management interface.</w:t>
+            </w:r>
+          </w:p>
+        </w:tc>
+      </w:tr>
+      <w:tr>
+        <w:tc>
+          <w:tcPr>
+            <w:tcW w:w="0" w:type="auto"/>
+          </w:tcPr>
+          <w:p>
+            <w:pPr>
+              <w:rPr>
+                <w:rFonts w:ascii="Century Schoolbook" w:hAnsi="Century Schoolbook"/>
+                <w:szCs w:val="22"/>
+              </w:rPr>
+            </w:pPr>
+            <w:r>
+              <w:rPr>
+                <w:rFonts w:ascii="Century Schoolbook" w:hAnsi="Century Schoolbook"/>
+                <w:szCs w:val="22"/>
+              </w:rPr>
+              <w:t>templates/academics/module_form.html</w:t>
+            </w:r>
+          </w:p>
+        </w:tc>
+        <w:tc>
+          <w:tcPr>
+            <w:tcW w:w="0" w:type="auto"/>
+          </w:tcPr>
+          <w:p>
+            <w:pPr>
+              <w:rPr>
+                <w:rFonts w:ascii="Century Schoolbook" w:hAnsi="Century Schoolbook"/>
+                <w:szCs w:val="22"/>
+              </w:rPr>
+            </w:pPr>
+            <w:r>
+              <w:rPr>
+                <w:rFonts w:ascii="Century Schoolbook" w:hAnsi="Century Schoolbook"/>
+                <w:szCs w:val="22"/>
+              </w:rPr>
+              <w:t>Provides the module create and edit form.</w:t>
+            </w:r>
+          </w:p>
+        </w:tc>
+      </w:tr>
+      <w:tr>
+        <w:tc>
+          <w:tcPr>
+            <w:tcW w:w="0" w:type="auto"/>
+          </w:tcPr>
+          <w:p>
+            <w:pPr>
+              <w:rPr>
+                <w:rFonts w:ascii="Century Schoolbook" w:hAnsi="Century Schoolbook"/>
+                <w:szCs w:val="22"/>
+              </w:rPr>
+            </w:pPr>
+            <w:r>
+              <w:rPr>
+                <w:rFonts w:ascii="Century Schoolbook" w:hAnsi="Century Schoolbook"/>
+                <w:szCs w:val="22"/>
+              </w:rPr>
+              <w:t>templates/academics/assessment_list.html</w:t>
+            </w:r>
+          </w:p>
+        </w:tc>
+        <w:tc>
+          <w:tcPr>
+            <w:tcW w:w="0" w:type="auto"/>
+          </w:tcPr>
+          <w:p>
+            <w:pPr>
+              <w:rPr>
+                <w:rFonts w:ascii="Century Schoolbook" w:hAnsi="Century Schoolbook"/>
+                <w:szCs w:val="22"/>
+              </w:rPr>
+            </w:pPr>
+            <w:r>
+              <w:rPr>
+                <w:rFonts w:ascii="Century Schoolbook" w:hAnsi="Century Schoolbook"/>
+                <w:szCs w:val="22"/>
+              </w:rPr>
+              <w:t>Displays assessment information and assessment management actions.</w:t>
+            </w:r>
+          </w:p>
+        </w:tc>
+      </w:tr>
+      <w:tr>
+        <w:tc>
+          <w:tcPr>
+            <w:tcW w:w="0" w:type="auto"/>
+          </w:tcPr>
+          <w:p>
+            <w:pPr>
+              <w:rPr>
+                <w:rFonts w:ascii="Century Schoolbook" w:hAnsi="Century Schoolbook"/>
+                <w:szCs w:val="22"/>
+              </w:rPr>
+            </w:pPr>
+            <w:r>
+              <w:rPr>
+                <w:rFonts w:ascii="Century Schoolbook" w:hAnsi="Century Schoolbook"/>
+                <w:szCs w:val="22"/>
+              </w:rPr>
+              <w:t>templates/academics/assessment_form.html</w:t>
+            </w:r>
+          </w:p>
+        </w:tc>
+        <w:tc>
+          <w:tcPr>
+            <w:tcW w:w="0" w:type="auto"/>
+          </w:tcPr>
+          <w:p>
+            <w:pPr>
+              <w:rPr>
+                <w:rFonts w:ascii="Century Schoolbook" w:hAnsi="Century Schoolbook"/>
+                <w:szCs w:val="22"/>
+              </w:rPr>
+            </w:pPr>
+            <w:r>
+              <w:rPr>
+                <w:rFonts w:ascii="Century Schoolbook" w:hAnsi="Century Schoolbook"/>
+                <w:szCs w:val="22"/>
+              </w:rPr>
+              <w:t>Provides the assessment create and edit form with validation feedback.</w:t>
             </w:r>
           </w:p>
         </w:tc>
@@ -505,31 +815,7 @@
     <w:p>
       <w:pPr>
         <w:rPr>
-          <w:rFonts w:ascii="Century Schoolbook" w:hAnsi="Century Schoolbook"/>
-          <w:szCs w:val="22"/>
-        </w:rPr>
-      </w:pPr>
-    </w:p>
-    <w:p>
-      <w:pPr>
-        <w:widowControl/>
-        <w:rPr>
-          <w:rFonts w:ascii="Century Schoolbook" w:hAnsi="Century Schoolbook"/>
-          <w:szCs w:val="22"/>
-        </w:rPr>
-      </w:pPr>
-      <w:r>
-        <w:rPr>
-          <w:rFonts w:ascii="Century Schoolbook" w:hAnsi="Century Schoolbook"/>
-          <w:szCs w:val="22"/>
-        </w:rPr>
-        <w:br w:type="page"/>
-      </w:r>
-    </w:p>
-    <w:p>
-      <w:pPr>
-        <w:rPr>
-          <w:rFonts w:ascii="Century Schoolbook" w:hAnsi="Century Schoolbook"/>
+          <w:rFonts w:ascii="Century Schoolbook" w:hAnsi="Century Schoolbook" w:hint="eastAsia"/>
           <w:szCs w:val="22"/>
         </w:rPr>
       </w:pPr>
@@ -550,6 +836,7 @@
           <w:bCs/>
           <w:szCs w:val="22"/>
         </w:rPr>
+        <w:lastRenderedPageBreak/>
         <w:t>Predominantly AI Assisted</w:t>
       </w:r>
     </w:p>
@@ -566,7 +853,7 @@
       <w:tr>
         <w:tc>
           <w:tcPr>
-            <w:tcW w:w="4248" w:type="dxa"/>
+            <w:tcW w:w="4817" w:type="dxa"/>
           </w:tcPr>
           <w:p>
             <w:pPr>
@@ -590,7 +877,7 @@
         </w:tc>
         <w:tc>
           <w:tcPr>
-            <w:tcW w:w="4048" w:type="dxa"/>
+            <w:tcW w:w="3479" w:type="dxa"/>
           </w:tcPr>
           <w:p>
             <w:pPr>
@@ -630,48 +917,6 @@
                 <w:rFonts w:ascii="Century Schoolbook" w:hAnsi="Century Schoolbook"/>
                 <w:szCs w:val="22"/>
               </w:rPr>
-              <w:t>academics/models.py</w:t>
-            </w:r>
-          </w:p>
-        </w:tc>
-        <w:tc>
-          <w:tcPr>
-            <w:tcW w:w="0" w:type="auto"/>
-          </w:tcPr>
-          <w:p>
-            <w:pPr>
-              <w:rPr>
-                <w:rFonts w:ascii="Century Schoolbook" w:hAnsi="Century Schoolbook"/>
-                <w:szCs w:val="22"/>
-              </w:rPr>
-            </w:pPr>
-            <w:r>
-              <w:rPr>
-                <w:rFonts w:ascii="Century Schoolbook" w:hAnsi="Century Schoolbook"/>
-                <w:szCs w:val="22"/>
-              </w:rPr>
-              <w:t>Defines the main academic data models and academic calculation logic.</w:t>
-            </w:r>
-          </w:p>
-        </w:tc>
-      </w:tr>
-      <w:tr>
-        <w:tc>
-          <w:tcPr>
-            <w:tcW w:w="0" w:type="auto"/>
-          </w:tcPr>
-          <w:p>
-            <w:pPr>
-              <w:rPr>
-                <w:rFonts w:ascii="Century Schoolbook" w:hAnsi="Century Schoolbook"/>
-                <w:szCs w:val="22"/>
-              </w:rPr>
-            </w:pPr>
-            <w:r>
-              <w:rPr>
-                <w:rFonts w:ascii="Century Schoolbook" w:hAnsi="Century Schoolbook"/>
-                <w:szCs w:val="22"/>
-              </w:rPr>
               <w:t>academics/forms.py</w:t>
             </w:r>
           </w:p>
@@ -756,258 +1001,6 @@
                 <w:rFonts w:ascii="Century Schoolbook" w:hAnsi="Century Schoolbook"/>
                 <w:szCs w:val="22"/>
               </w:rPr>
-              <w:t>templates/academics/semester_list.html</w:t>
-            </w:r>
-          </w:p>
-        </w:tc>
-        <w:tc>
-          <w:tcPr>
-            <w:tcW w:w="0" w:type="auto"/>
-          </w:tcPr>
-          <w:p>
-            <w:pPr>
-              <w:rPr>
-                <w:rFonts w:ascii="Century Schoolbook" w:hAnsi="Century Schoolbook"/>
-                <w:szCs w:val="22"/>
-              </w:rPr>
-            </w:pPr>
-            <w:r>
-              <w:rPr>
-                <w:rFonts w:ascii="Century Schoolbook" w:hAnsi="Century Schoolbook"/>
-                <w:szCs w:val="22"/>
-              </w:rPr>
-              <w:t>Provides the semester management interface.</w:t>
-            </w:r>
-          </w:p>
-        </w:tc>
-      </w:tr>
-      <w:tr>
-        <w:tc>
-          <w:tcPr>
-            <w:tcW w:w="0" w:type="auto"/>
-          </w:tcPr>
-          <w:p>
-            <w:pPr>
-              <w:rPr>
-                <w:rFonts w:ascii="Century Schoolbook" w:hAnsi="Century Schoolbook"/>
-                <w:szCs w:val="22"/>
-              </w:rPr>
-            </w:pPr>
-            <w:r>
-              <w:rPr>
-                <w:rFonts w:ascii="Century Schoolbook" w:hAnsi="Century Schoolbook"/>
-                <w:szCs w:val="22"/>
-              </w:rPr>
-              <w:t>templates/academics/semester_form.html</w:t>
-            </w:r>
-          </w:p>
-        </w:tc>
-        <w:tc>
-          <w:tcPr>
-            <w:tcW w:w="0" w:type="auto"/>
-          </w:tcPr>
-          <w:p>
-            <w:pPr>
-              <w:rPr>
-                <w:rFonts w:ascii="Century Schoolbook" w:hAnsi="Century Schoolbook"/>
-                <w:szCs w:val="22"/>
-              </w:rPr>
-            </w:pPr>
-            <w:r>
-              <w:rPr>
-                <w:rFonts w:ascii="Century Schoolbook" w:hAnsi="Century Schoolbook"/>
-                <w:szCs w:val="22"/>
-              </w:rPr>
-              <w:t>Provides the semester create and edit form.</w:t>
-            </w:r>
-          </w:p>
-        </w:tc>
-      </w:tr>
-      <w:tr>
-        <w:tc>
-          <w:tcPr>
-            <w:tcW w:w="0" w:type="auto"/>
-          </w:tcPr>
-          <w:p>
-            <w:pPr>
-              <w:rPr>
-                <w:rFonts w:ascii="Century Schoolbook" w:hAnsi="Century Schoolbook"/>
-                <w:szCs w:val="22"/>
-              </w:rPr>
-            </w:pPr>
-            <w:r>
-              <w:rPr>
-                <w:rFonts w:ascii="Century Schoolbook" w:hAnsi="Century Schoolbook"/>
-                <w:szCs w:val="22"/>
-              </w:rPr>
-              <w:t>templates/academics/module_list.html</w:t>
-            </w:r>
-          </w:p>
-        </w:tc>
-        <w:tc>
-          <w:tcPr>
-            <w:tcW w:w="0" w:type="auto"/>
-          </w:tcPr>
-          <w:p>
-            <w:pPr>
-              <w:rPr>
-                <w:rFonts w:ascii="Century Schoolbook" w:hAnsi="Century Schoolbook"/>
-                <w:szCs w:val="22"/>
-              </w:rPr>
-            </w:pPr>
-            <w:r>
-              <w:rPr>
-                <w:rFonts w:ascii="Century Schoolbook" w:hAnsi="Century Schoolbook"/>
-                <w:szCs w:val="22"/>
-              </w:rPr>
-              <w:t>Provides the module management interface.</w:t>
-            </w:r>
-          </w:p>
-        </w:tc>
-      </w:tr>
-      <w:tr>
-        <w:tc>
-          <w:tcPr>
-            <w:tcW w:w="0" w:type="auto"/>
-          </w:tcPr>
-          <w:p>
-            <w:pPr>
-              <w:rPr>
-                <w:rFonts w:ascii="Century Schoolbook" w:hAnsi="Century Schoolbook"/>
-                <w:szCs w:val="22"/>
-              </w:rPr>
-            </w:pPr>
-            <w:r>
-              <w:rPr>
-                <w:rFonts w:ascii="Century Schoolbook" w:hAnsi="Century Schoolbook"/>
-                <w:szCs w:val="22"/>
-              </w:rPr>
-              <w:t>templates/academics/module_form.html</w:t>
-            </w:r>
-          </w:p>
-        </w:tc>
-        <w:tc>
-          <w:tcPr>
-            <w:tcW w:w="0" w:type="auto"/>
-          </w:tcPr>
-          <w:p>
-            <w:pPr>
-              <w:rPr>
-                <w:rFonts w:ascii="Century Schoolbook" w:hAnsi="Century Schoolbook"/>
-                <w:szCs w:val="22"/>
-              </w:rPr>
-            </w:pPr>
-            <w:r>
-              <w:rPr>
-                <w:rFonts w:ascii="Century Schoolbook" w:hAnsi="Century Schoolbook"/>
-                <w:szCs w:val="22"/>
-              </w:rPr>
-              <w:t>Provides the module create and edit form.</w:t>
-            </w:r>
-          </w:p>
-        </w:tc>
-      </w:tr>
-      <w:tr>
-        <w:tc>
-          <w:tcPr>
-            <w:tcW w:w="0" w:type="auto"/>
-          </w:tcPr>
-          <w:p>
-            <w:pPr>
-              <w:rPr>
-                <w:rFonts w:ascii="Century Schoolbook" w:hAnsi="Century Schoolbook"/>
-                <w:szCs w:val="22"/>
-              </w:rPr>
-            </w:pPr>
-            <w:r>
-              <w:rPr>
-                <w:rFonts w:ascii="Century Schoolbook" w:hAnsi="Century Schoolbook"/>
-                <w:szCs w:val="22"/>
-              </w:rPr>
-              <w:t>templates/academics/assessment_list.html</w:t>
-            </w:r>
-          </w:p>
-        </w:tc>
-        <w:tc>
-          <w:tcPr>
-            <w:tcW w:w="0" w:type="auto"/>
-          </w:tcPr>
-          <w:p>
-            <w:pPr>
-              <w:rPr>
-                <w:rFonts w:ascii="Century Schoolbook" w:hAnsi="Century Schoolbook"/>
-                <w:szCs w:val="22"/>
-              </w:rPr>
-            </w:pPr>
-            <w:r>
-              <w:rPr>
-                <w:rFonts w:ascii="Century Schoolbook" w:hAnsi="Century Schoolbook"/>
-                <w:szCs w:val="22"/>
-              </w:rPr>
-              <w:t>Displays assessment information and assessment management actions.</w:t>
-            </w:r>
-          </w:p>
-        </w:tc>
-      </w:tr>
-      <w:tr>
-        <w:tc>
-          <w:tcPr>
-            <w:tcW w:w="0" w:type="auto"/>
-          </w:tcPr>
-          <w:p>
-            <w:pPr>
-              <w:rPr>
-                <w:rFonts w:ascii="Century Schoolbook" w:hAnsi="Century Schoolbook"/>
-                <w:szCs w:val="22"/>
-              </w:rPr>
-            </w:pPr>
-            <w:r>
-              <w:rPr>
-                <w:rFonts w:ascii="Century Schoolbook" w:hAnsi="Century Schoolbook"/>
-                <w:szCs w:val="22"/>
-              </w:rPr>
-              <w:t>templates/academics/assessment_form.html</w:t>
-            </w:r>
-          </w:p>
-        </w:tc>
-        <w:tc>
-          <w:tcPr>
-            <w:tcW w:w="0" w:type="auto"/>
-          </w:tcPr>
-          <w:p>
-            <w:pPr>
-              <w:rPr>
-                <w:rFonts w:ascii="Century Schoolbook" w:hAnsi="Century Schoolbook"/>
-                <w:szCs w:val="22"/>
-              </w:rPr>
-            </w:pPr>
-            <w:r>
-              <w:rPr>
-                <w:rFonts w:ascii="Century Schoolbook" w:hAnsi="Century Schoolbook"/>
-                <w:szCs w:val="22"/>
-              </w:rPr>
-              <w:t>Provides the assessment create and edit form with validation feedback.</w:t>
-            </w:r>
-          </w:p>
-        </w:tc>
-      </w:tr>
-      <w:tr>
-        <w:tc>
-          <w:tcPr>
-            <w:tcW w:w="0" w:type="auto"/>
-          </w:tcPr>
-          <w:p>
-            <w:pPr>
-              <w:rPr>
-                <w:rFonts w:ascii="Century Schoolbook" w:hAnsi="Century Schoolbook"/>
-                <w:szCs w:val="22"/>
-              </w:rPr>
-            </w:pPr>
-            <w:r>
-              <w:rPr>
-                <w:rFonts w:ascii="Century Schoolbook" w:hAnsi="Century Schoolbook"/>
-                <w:szCs w:val="22"/>
-              </w:rPr>
               <w:t>templates/academics/grade_tracking.html</w:t>
             </w:r>
           </w:p>
@@ -1322,7 +1315,23 @@
                 <w:rFonts w:ascii="Century Schoolbook" w:hAnsi="Century Schoolbook"/>
                 <w:szCs w:val="22"/>
               </w:rPr>
-              <w:t>templates/analytics.html</w:t>
+              <w:t xml:space="preserve">Presents performance, assessment-progress and workload data through dynamically sized </w:t>
+            </w:r>
+            <w:proofErr w:type="spellStart"/>
+            <w:r>
+              <w:rPr>
+                <w:rFonts w:ascii="Century Schoolbook" w:hAnsi="Century Schoolbook"/>
+                <w:szCs w:val="22"/>
+              </w:rPr>
+              <w:t>visualisations</w:t>
+            </w:r>
+            <w:proofErr w:type="spellEnd"/>
+            <w:r>
+              <w:rPr>
+                <w:rFonts w:ascii="Century Schoolbook" w:hAnsi="Century Schoolbook"/>
+                <w:szCs w:val="22"/>
+              </w:rPr>
+              <w:t>.</w:t>
             </w:r>
           </w:p>
         </w:tc>
@@ -1454,13 +1463,7 @@
         </w:tc>
       </w:tr>
     </w:tbl>
-    <w:p>
-      <w:pPr>
-        <w:rPr>
-          <w:rFonts w:hint="eastAsia"/>
-        </w:rPr>
-      </w:pPr>
-    </w:p>
+    <w:p/>
     <w:sectPr>
       <w:pgSz w:w="11906" w:h="16838"/>
       <w:pgMar w:top="1440" w:right="1800" w:bottom="1440" w:left="1800" w:header="851" w:footer="992" w:gutter="0"/>

</xml_diff>